<commit_message>
chore: remove outdated property analysis and GEO audit report files
This commit deletes the GEO Audit Report and various property analysis files related to 3788 Moon Bay Cir, including comparable sales, rental income, investment analysis, and neighborhood assessments. These files are no longer relevant and have been removed to streamline the project structure.
</commit_message>
<xml_diff>
--- a/docs/product/DealGapIQ-Feature-Audit.docx
+++ b/docs/product/DealGapIQ-Feature-Audit.docx
@@ -764,29 +764,29 @@
               <w:pStyle w:val="Compact"/>
             </w:pPr>
             <w:r>
-              <w:t xml:space="preserve">Three price anchors</w:t>
-            </w:r>
-          </w:p>
-        </w:tc>
-        <w:tc>
-          <w:tcPr/>
-          <w:p>
-            <w:pPr>
-              <w:pStyle w:val="Compact"/>
-            </w:pPr>
-            <w:r>
-              <w:t xml:space="preserve">Breakeven, Target Buy, Wholesale (Income Value ladder)</w:t>
-            </w:r>
-          </w:p>
-        </w:tc>
-        <w:tc>
-          <w:tcPr/>
-          <w:p>
-            <w:pPr>
-              <w:pStyle w:val="Compact"/>
-            </w:pPr>
-            <w:r>
-              <w:t xml:space="preserve">Converts abstract valuation into actionable offer bands</w:t>
+              <w:t xml:space="preserve">Three price signals</w:t>
+            </w:r>
+          </w:p>
+        </w:tc>
+        <w:tc>
+          <w:tcPr/>
+          <w:p>
+            <w:pPr>
+              <w:pStyle w:val="Compact"/>
+            </w:pPr>
+            <w:r>
+              <w:t xml:space="preserve">Income Value, Target Buy, and Deal Gap</w:t>
+            </w:r>
+          </w:p>
+        </w:tc>
+        <w:tc>
+          <w:tcPr/>
+          <w:p>
+            <w:pPr>
+              <w:pStyle w:val="Compact"/>
+            </w:pPr>
+            <w:r>
+              <w:t xml:space="preserve">Converts abstract valuation into actionable offer bands and negotiation distance</w:t>
             </w:r>
           </w:p>
         </w:tc>

</xml_diff>

<commit_message>
docs: update DealGapIQ feature audit with corrections and clarifications
This commit enhances the DealGapIQ feature audit documentation by correcting inaccuracies regarding the free tier, pro pricing, mobile framework, and user-facing metrics. It also clarifies the definitions of key metrics such as Income Value, Target Buy, and Deal Gap, ensuring consistency and accuracy throughout the document. Additionally, it includes updates to the Cash Buyer and Hard Money Lender directories, as well as notes on gating and internal metrics.
</commit_message>
<xml_diff>
--- a/docs/product/DealGapIQ-Feature-Audit.docx
+++ b/docs/product/DealGapIQ-Feature-Audit.docx
@@ -26,7 +26,7 @@
         <w:t xml:space="preserve">June 9, 2026</w:t>
       </w:r>
     </w:p>
-    <w:bookmarkStart w:id="42" w:name="dealgapiq-comprehensive-feature-audit"/>
+    <w:bookmarkStart w:id="43" w:name="dealgapiq-comprehensive-feature-audit"/>
     <w:p>
       <w:pPr>
         <w:pStyle w:val="Heading1"/>
@@ -92,7 +92,7 @@
         </w:pict>
       </w:r>
     </w:p>
-    <w:bookmarkStart w:id="9" w:name="executive-summary"/>
+    <w:bookmarkStart w:id="10" w:name="executive-summary"/>
     <w:p>
       <w:pPr>
         <w:pStyle w:val="Heading2"/>
@@ -173,6 +173,152 @@
         <w:t xml:space="preserve">rather than fabricating missing values.</w:t>
       </w:r>
     </w:p>
+    <w:bookmarkStart w:id="9" w:name="Xb70020df93dd3f2e85c2eb7c14a18057d796818"/>
+    <w:p>
+      <w:pPr>
+        <w:pStyle w:val="Heading3"/>
+      </w:pPr>
+      <w:r>
+        <w:t xml:space="preserve">Corrections to legacy materials (read before reusing old copy)</w:t>
+      </w:r>
+    </w:p>
+    <w:p>
+      <w:pPr>
+        <w:pStyle w:val="FirstParagraph"/>
+      </w:pPr>
+      <w:r>
+        <w:t xml:space="preserve">These items have appeared incorrectly in earlier decks, scripts, or store listings and are corrected throughout this document:</w:t>
+      </w:r>
+    </w:p>
+    <w:p>
+      <w:pPr>
+        <w:pStyle w:val="Compact"/>
+        <w:numPr>
+          <w:ilvl w:val="0"/>
+          <w:numId w:val="1001"/>
+        </w:numPr>
+      </w:pPr>
+      <w:r>
+        <w:rPr>
+          <w:b/>
+          <w:bCs/>
+        </w:rPr>
+        <w:t xml:space="preserve">Free tier is 3 analyses/month</w:t>
+      </w:r>
+      <w:r>
+        <w:t xml:space="preserve"> </w:t>
+      </w:r>
+      <w:r>
+        <w:t xml:space="preserve">(and 3 saved properties), not 5.</w:t>
+      </w:r>
+    </w:p>
+    <w:p>
+      <w:pPr>
+        <w:pStyle w:val="Compact"/>
+        <w:numPr>
+          <w:ilvl w:val="0"/>
+          <w:numId w:val="1001"/>
+        </w:numPr>
+      </w:pPr>
+      <w:r>
+        <w:rPr>
+          <w:b/>
+          <w:bCs/>
+        </w:rPr>
+        <w:t xml:space="preserve">Pro pricing is $39.99/mo monthly or $349.99/yr (~$29.17/mo effective)</w:t>
+      </w:r>
+      <w:r>
+        <w:t xml:space="preserve"> </w:t>
+      </w:r>
+      <w:r>
+        <w:t xml:space="preserve">with a 7-day trial — not</w:t>
+      </w:r>
+      <w:r>
+        <w:t xml:space="preserve"> </w:t>
+      </w:r>
+      <w:r>
+        <w:t xml:space="preserve">“$29 / $39.”</w:t>
+      </w:r>
+    </w:p>
+    <w:p>
+      <w:pPr>
+        <w:pStyle w:val="Compact"/>
+        <w:numPr>
+          <w:ilvl w:val="0"/>
+          <w:numId w:val="1001"/>
+        </w:numPr>
+      </w:pPr>
+      <w:r>
+        <w:rPr>
+          <w:b/>
+          <w:bCs/>
+        </w:rPr>
+        <w:t xml:space="preserve">Mobile is Capacitor</w:t>
+      </w:r>
+      <w:r>
+        <w:t xml:space="preserve">, not Expo/React Native.</w:t>
+      </w:r>
+    </w:p>
+    <w:p>
+      <w:pPr>
+        <w:pStyle w:val="Compact"/>
+        <w:numPr>
+          <w:ilvl w:val="0"/>
+          <w:numId w:val="1001"/>
+        </w:numPr>
+      </w:pPr>
+      <w:r>
+        <w:rPr>
+          <w:b/>
+          <w:bCs/>
+        </w:rPr>
+        <w:t xml:space="preserve">Category is residential real estate investment analysis</w:t>
+      </w:r>
+      <w:r>
+        <w:t xml:space="preserve">, not</w:t>
+      </w:r>
+      <w:r>
+        <w:t xml:space="preserve"> </w:t>
+      </w:r>
+      <w:r>
+        <w:t xml:space="preserve">“deal intelligence / sales enablement.”</w:t>
+      </w:r>
+    </w:p>
+    <w:p>
+      <w:pPr>
+        <w:pStyle w:val="Compact"/>
+        <w:numPr>
+          <w:ilvl w:val="0"/>
+          <w:numId w:val="1001"/>
+        </w:numPr>
+      </w:pPr>
+      <w:r>
+        <w:rPr>
+          <w:b/>
+          <w:bCs/>
+        </w:rPr>
+        <w:t xml:space="preserve">The three user-facing metrics are Income Value, Target Buy, and Deal Gap.</w:t>
+      </w:r>
+      <w:r>
+        <w:t xml:space="preserve"> </w:t>
+      </w:r>
+      <w:r>
+        <w:t xml:space="preserve">A separate internal value,</w:t>
+      </w:r>
+      <w:r>
+        <w:t xml:space="preserve"> </w:t>
+      </w:r>
+      <w:r>
+        <w:rPr>
+          <w:b/>
+          <w:bCs/>
+        </w:rPr>
+        <w:t xml:space="preserve">Income Gap</w:t>
+      </w:r>
+      <w:r>
+        <w:t xml:space="preserve">, powers the Verdict engine and is not shown to users — keep it out of user-facing copy.</w:t>
+      </w:r>
+    </w:p>
     <w:p>
       <w:r>
         <w:pict>
@@ -181,7 +327,8 @@
       </w:r>
     </w:p>
     <w:bookmarkEnd w:id="9"/>
-    <w:bookmarkStart w:id="29" w:name="hierarchical-feature-inventory"/>
+    <w:bookmarkEnd w:id="10"/>
+    <w:bookmarkStart w:id="30" w:name="hierarchical-feature-inventory"/>
     <w:p>
       <w:pPr>
         <w:pStyle w:val="Heading2"/>
@@ -190,7 +337,7 @@
         <w:t xml:space="preserve">1. Hierarchical Feature Inventory</w:t>
       </w:r>
     </w:p>
-    <w:bookmarkStart w:id="10" w:name="property-discovery-entry"/>
+    <w:bookmarkStart w:id="11" w:name="property-discovery-entry"/>
     <w:p>
       <w:pPr>
         <w:pStyle w:val="Heading3"/>
@@ -331,41 +478,6 @@
               <w:pStyle w:val="Compact"/>
             </w:pPr>
             <w:r>
-              <w:t xml:space="preserve">Zillow URL / listing paste</w:t>
-            </w:r>
-          </w:p>
-        </w:tc>
-        <w:tc>
-          <w:tcPr/>
-          <w:p>
-            <w:pPr>
-              <w:pStyle w:val="Compact"/>
-            </w:pPr>
-            <w:r>
-              <w:t xml:space="preserve">Accepts listing URLs and street addresses</w:t>
-            </w:r>
-          </w:p>
-        </w:tc>
-        <w:tc>
-          <w:tcPr/>
-          <w:p>
-            <w:pPr>
-              <w:pStyle w:val="Compact"/>
-            </w:pPr>
-            <w:r>
-              <w:t xml:space="preserve">Meets investors where they already browse listings</w:t>
-            </w:r>
-          </w:p>
-        </w:tc>
-      </w:tr>
-      <w:tr>
-        <w:tc>
-          <w:tcPr/>
-          <w:p>
-            <w:pPr>
-              <w:pStyle w:val="Compact"/>
-            </w:pPr>
-            <w:r>
               <w:t xml:space="preserve">Map Search entry</w:t>
             </w:r>
           </w:p>
@@ -418,16 +530,19 @@
               <w:pStyle w:val="Compact"/>
             </w:pPr>
             <w:r>
-              <w:t xml:space="preserve">Mobile camera capture for address/sign reading (</w:t>
+              <w:t xml:space="preserve">Mobile camera capture to scan a property for instant lookup (</w:t>
             </w:r>
             <w:r>
               <w:rPr>
                 <w:rStyle w:val="VerbatimChar"/>
               </w:rPr>
-              <w:t xml:space="preserve">HomeScannerIsland</w:t>
-            </w:r>
-            <w:r>
-              <w:t xml:space="preserve">, Capacitor)</w:t>
+              <w:t xml:space="preserve">SearchPropertyModal</w:t>
+            </w:r>
+            <w:r>
+              <w:t xml:space="preserve"> </w:t>
+            </w:r>
+            <w:r>
+              <w:t xml:space="preserve">→ scan flow, Capacitor); desktop shows an info dialog directing to address entry</w:t>
             </w:r>
           </w:p>
         </w:tc>
@@ -539,8 +654,8 @@
         </w:pict>
       </w:r>
     </w:p>
-    <w:bookmarkEnd w:id="10"/>
-    <w:bookmarkStart w:id="15" w:name="discovery-iq-verdict"/>
+    <w:bookmarkEnd w:id="11"/>
+    <w:bookmarkStart w:id="16" w:name="discovery-iq-verdict"/>
     <w:p>
       <w:pPr>
         <w:pStyle w:val="Heading3"/>
@@ -586,7 +701,7 @@
         <w:t xml:space="preserve">Deliver a plain-English investment verdict and ranked strategy recommendations in one screen.</w:t>
       </w:r>
     </w:p>
-    <w:bookmarkStart w:id="11" w:name="core-valuation-verdict-metrics"/>
+    <w:bookmarkStart w:id="12" w:name="core-valuation-verdict-metrics"/>
     <w:p>
       <w:pPr>
         <w:pStyle w:val="Heading4"/>
@@ -764,64 +879,127 @@
               <w:pStyle w:val="Compact"/>
             </w:pPr>
             <w:r>
-              <w:t xml:space="preserve">Three price signals</w:t>
-            </w:r>
-          </w:p>
-        </w:tc>
-        <w:tc>
-          <w:tcPr/>
-          <w:p>
-            <w:pPr>
-              <w:pStyle w:val="Compact"/>
-            </w:pPr>
-            <w:r>
-              <w:t xml:space="preserve">Income Value, Target Buy, and Deal Gap</w:t>
-            </w:r>
-          </w:p>
-        </w:tc>
-        <w:tc>
-          <w:tcPr/>
-          <w:p>
-            <w:pPr>
-              <w:pStyle w:val="Compact"/>
-            </w:pPr>
-            <w:r>
-              <w:t xml:space="preserve">Converts abstract valuation into actionable offer bands and negotiation distance</w:t>
-            </w:r>
-          </w:p>
-        </w:tc>
-      </w:tr>
-      <w:tr>
-        <w:tc>
-          <w:tcPr/>
-          <w:p>
-            <w:pPr>
-              <w:pStyle w:val="Compact"/>
-            </w:pPr>
-            <w:r>
-              <w:t xml:space="preserve">Deal Gap %</w:t>
-            </w:r>
-          </w:p>
-        </w:tc>
-        <w:tc>
-          <w:tcPr/>
-          <w:p>
-            <w:pPr>
-              <w:pStyle w:val="Compact"/>
-            </w:pPr>
-            <w:r>
-              <w:t xml:space="preserve">Verified/target value vs. asking or estimated market price</w:t>
-            </w:r>
-          </w:p>
-        </w:tc>
-        <w:tc>
-          <w:tcPr/>
-          <w:p>
-            <w:pPr>
-              <w:pStyle w:val="Compact"/>
-            </w:pPr>
-            <w:r>
-              <w:t xml:space="preserve">Single headline metric for deal quality at a glance</w:t>
+              <w:rPr>
+                <w:b/>
+                <w:bCs/>
+              </w:rPr>
+              <w:t xml:space="preserve">Income Value</w:t>
+            </w:r>
+          </w:p>
+        </w:tc>
+        <w:tc>
+          <w:tcPr/>
+          <w:p>
+            <w:pPr>
+              <w:pStyle w:val="Compact"/>
+            </w:pPr>
+            <w:r>
+              <w:t xml:space="preserve">Maximum price at which the property still produces positive cash flow under a given strategy (the income ceiling)</w:t>
+            </w:r>
+          </w:p>
+        </w:tc>
+        <w:tc>
+          <w:tcPr/>
+          <w:p>
+            <w:pPr>
+              <w:pStyle w:val="Compact"/>
+            </w:pPr>
+            <w:r>
+              <w:t xml:space="preserve">Grounds the deal in what income supports, not asking-price hype</w:t>
+            </w:r>
+          </w:p>
+        </w:tc>
+      </w:tr>
+      <w:tr>
+        <w:tc>
+          <w:tcPr/>
+          <w:p>
+            <w:pPr>
+              <w:pStyle w:val="Compact"/>
+            </w:pPr>
+            <w:r>
+              <w:rPr>
+                <w:b/>
+                <w:bCs/>
+              </w:rPr>
+              <w:t xml:space="preserve">Target Buy</w:t>
+            </w:r>
+          </w:p>
+        </w:tc>
+        <w:tc>
+          <w:tcPr/>
+          <w:p>
+            <w:pPr>
+              <w:pStyle w:val="Compact"/>
+            </w:pPr>
+            <w:r>
+              <w:t xml:space="preserve">Price at which the property meets return thresholds for the active strategy</w:t>
+            </w:r>
+          </w:p>
+        </w:tc>
+        <w:tc>
+          <w:tcPr/>
+          <w:p>
+            <w:pPr>
+              <w:pStyle w:val="Compact"/>
+            </w:pPr>
+            <w:r>
+              <w:t xml:space="preserve">Converts valuation into an actionable offer number</w:t>
+            </w:r>
+          </w:p>
+        </w:tc>
+      </w:tr>
+      <w:tr>
+        <w:tc>
+          <w:tcPr/>
+          <w:p>
+            <w:pPr>
+              <w:pStyle w:val="Compact"/>
+            </w:pPr>
+            <w:r>
+              <w:rPr>
+                <w:b/>
+                <w:bCs/>
+              </w:rPr>
+              <w:t xml:space="preserve">Deal Gap</w:t>
+            </w:r>
+          </w:p>
+        </w:tc>
+        <w:tc>
+          <w:tcPr/>
+          <w:p>
+            <w:pPr>
+              <w:pStyle w:val="Compact"/>
+            </w:pPr>
+            <w:r>
+              <w:t xml:space="preserve">Percentage distance between asking/market price and</w:t>
+            </w:r>
+            <w:r>
+              <w:t xml:space="preserve"> </w:t>
+            </w:r>
+            <w:r>
+              <w:rPr>
+                <w:b/>
+                <w:bCs/>
+              </w:rPr>
+              <w:t xml:space="preserve">Target Buy</w:t>
+            </w:r>
+            <w:r>
+              <w:t xml:space="preserve"> </w:t>
+            </w:r>
+            <w:r>
+              <w:t xml:space="preserve">(List Price − Target Buy)</w:t>
+            </w:r>
+          </w:p>
+        </w:tc>
+        <w:tc>
+          <w:tcPr/>
+          <w:p>
+            <w:pPr>
+              <w:pStyle w:val="Compact"/>
+            </w:pPr>
+            <w:r>
+              <w:t xml:space="preserve">Single headline metric for negotiation distance and deal quality</w:t>
             </w:r>
           </w:p>
         </w:tc>
@@ -967,8 +1145,42 @@
         </w:tc>
       </w:tr>
     </w:tbl>
-    <w:bookmarkEnd w:id="11"/>
-    <w:bookmarkStart w:id="12" w:name="strategy-intelligence-discovery-level"/>
+    <w:p>
+      <w:pPr>
+        <w:pStyle w:val="BodyText"/>
+      </w:pPr>
+      <w:r>
+        <w:rPr>
+          <w:i/>
+          <w:iCs/>
+        </w:rPr>
+        <w:t xml:space="preserve">Internal note:</w:t>
+      </w:r>
+      <w:r>
+        <w:t xml:space="preserve"> </w:t>
+      </w:r>
+      <w:r>
+        <w:t xml:space="preserve">a separate</w:t>
+      </w:r>
+      <w:r>
+        <w:t xml:space="preserve"> </w:t>
+      </w:r>
+      <w:r>
+        <w:rPr>
+          <w:b/>
+          <w:bCs/>
+        </w:rPr>
+        <w:t xml:space="preserve">Income Gap</w:t>
+      </w:r>
+      <w:r>
+        <w:t xml:space="preserve"> </w:t>
+      </w:r>
+      <w:r>
+        <w:t xml:space="preserve">value (List Price − Income Value) drives parts of the Verdict engine. It is intentionally not surfaced as a fourth user metric — the clean three-metric story (Income Value, Target Buy, Deal Gap) is a strategic asset.</w:t>
+      </w:r>
+    </w:p>
+    <w:bookmarkEnd w:id="12"/>
+    <w:bookmarkStart w:id="13" w:name="strategy-intelligence-discovery-level"/>
     <w:p>
       <w:pPr>
         <w:pStyle w:val="Heading4"/>
@@ -1275,8 +1487,8 @@
         </w:tc>
       </w:tr>
     </w:tbl>
-    <w:bookmarkEnd w:id="12"/>
-    <w:bookmarkStart w:id="13" w:name="four-paths-offer-structures"/>
+    <w:bookmarkEnd w:id="13"/>
+    <w:bookmarkStart w:id="14" w:name="four-paths-offer-structures"/>
     <w:p>
       <w:pPr>
         <w:pStyle w:val="Heading4"/>
@@ -1646,8 +1858,8 @@
         </w:tc>
       </w:tr>
     </w:tbl>
-    <w:bookmarkEnd w:id="13"/>
-    <w:bookmarkStart w:id="14" w:name="negotiation-playbook"/>
+    <w:bookmarkEnd w:id="14"/>
+    <w:bookmarkStart w:id="15" w:name="negotiation-playbook"/>
     <w:p>
       <w:pPr>
         <w:pStyle w:val="Heading4"/>
@@ -1831,9 +2043,9 @@
         </w:pict>
       </w:r>
     </w:p>
-    <w:bookmarkEnd w:id="14"/>
     <w:bookmarkEnd w:id="15"/>
-    <w:bookmarkStart w:id="16" w:name="strategy-analysis-financial-deep-dive"/>
+    <w:bookmarkEnd w:id="16"/>
+    <w:bookmarkStart w:id="17" w:name="strategy-analysis-financial-deep-dive"/>
     <w:p>
       <w:pPr>
         <w:pStyle w:val="Heading3"/>
@@ -2547,8 +2759,8 @@
         </w:pict>
       </w:r>
     </w:p>
-    <w:bookmarkEnd w:id="16"/>
-    <w:bookmarkStart w:id="17" w:name="deal-maker-interactive-worksheet"/>
+    <w:bookmarkEnd w:id="17"/>
+    <w:bookmarkStart w:id="18" w:name="deal-maker-interactive-worksheet"/>
     <w:p>
       <w:pPr>
         <w:pStyle w:val="Heading3"/>
@@ -3014,8 +3226,8 @@
         </w:pict>
       </w:r>
     </w:p>
-    <w:bookmarkEnd w:id="17"/>
-    <w:bookmarkStart w:id="18" w:name="comps-market-intelligence-price-intel"/>
+    <w:bookmarkEnd w:id="18"/>
+    <w:bookmarkStart w:id="19" w:name="comps-market-intelligence-price-intel"/>
     <w:p>
       <w:pPr>
         <w:pStyle w:val="Heading3"/>
@@ -3539,8 +3751,8 @@
         </w:pict>
       </w:r>
     </w:p>
-    <w:bookmarkEnd w:id="18"/>
-    <w:bookmarkStart w:id="19" w:name="rehab-estimator-budget-tracking"/>
+    <w:bookmarkEnd w:id="19"/>
+    <w:bookmarkStart w:id="20" w:name="rehab-estimator-budget-tracking"/>
     <w:p>
       <w:pPr>
         <w:pStyle w:val="Heading3"/>
@@ -3920,8 +4132,8 @@
         </w:pict>
       </w:r>
     </w:p>
-    <w:bookmarkEnd w:id="19"/>
-    <w:bookmarkStart w:id="20" w:name="map-search-interactive-listing-discovery"/>
+    <w:bookmarkEnd w:id="20"/>
+    <w:bookmarkStart w:id="21" w:name="map-search-interactive-listing-discovery"/>
     <w:p>
       <w:pPr>
         <w:pStyle w:val="Heading3"/>
@@ -4400,8 +4612,8 @@
         </w:pict>
       </w:r>
     </w:p>
-    <w:bookmarkEnd w:id="20"/>
-    <w:bookmarkStart w:id="21" w:name="pipeline-deal-management-collaboration"/>
+    <w:bookmarkEnd w:id="21"/>
+    <w:bookmarkStart w:id="22" w:name="pipeline-deal-management-collaboration"/>
     <w:p>
       <w:pPr>
         <w:pStyle w:val="Heading3"/>
@@ -5077,8 +5289,8 @@
         </w:pict>
       </w:r>
     </w:p>
-    <w:bookmarkEnd w:id="21"/>
-    <w:bookmarkStart w:id="22" w:name="investor-directories-pro-paid-active"/>
+    <w:bookmarkEnd w:id="22"/>
+    <w:bookmarkStart w:id="23" w:name="investor-directories-pro-paid-active"/>
     <w:p>
       <w:pPr>
         <w:pStyle w:val="Heading3"/>
@@ -5198,7 +5410,19 @@
               <w:pStyle w:val="Compact"/>
             </w:pPr>
             <w:r>
-              <w:t xml:space="preserve">Verified investor contacts by market</w:t>
+              <w:t xml:space="preserve">~2,800+ verified investor contacts by market (live count from</w:t>
+            </w:r>
+            <w:r>
+              <w:t xml:space="preserve"> </w:t>
+            </w:r>
+            <w:r>
+              <w:rPr>
+                <w:rStyle w:val="VerbatimChar"/>
+              </w:rPr>
+              <w:t xml:space="preserve">/api/buyers/stats</w:t>
+            </w:r>
+            <w:r>
+              <w:t xml:space="preserve">; marketing fallback when unavailable)</w:t>
             </w:r>
           </w:p>
         </w:tc>
@@ -5233,7 +5457,16 @@
               <w:pStyle w:val="Compact"/>
             </w:pPr>
             <w:r>
-              <w:t xml:space="preserve">Fix &amp; flip, BRRRR, bridge, DSCR products</w:t>
+              <w:t xml:space="preserve">484 verified lenders — fix &amp; flip, BRRRR, bridge, DSCR products (</w:t>
+            </w:r>
+            <w:r>
+              <w:rPr>
+                <w:rStyle w:val="VerbatimChar"/>
+              </w:rPr>
+              <w:t xml:space="preserve">lenders.json</w:t>
+            </w:r>
+            <w:r>
+              <w:t xml:space="preserve">)</w:t>
             </w:r>
           </w:p>
         </w:tc>
@@ -5284,7 +5517,94 @@
           </w:p>
         </w:tc>
       </w:tr>
+      <w:tr>
+        <w:tc>
+          <w:tcPr/>
+          <w:p>
+            <w:pPr>
+              <w:pStyle w:val="Compact"/>
+            </w:pPr>
+            <w:r>
+              <w:t xml:space="preserve">Non-Pro teaser</w:t>
+            </w:r>
+          </w:p>
+        </w:tc>
+        <w:tc>
+          <w:tcPr/>
+          <w:p>
+            <w:pPr>
+              <w:pStyle w:val="Compact"/>
+            </w:pPr>
+            <w:r>
+              <w:t xml:space="preserve">Total buyer count shown to free users to drive upgrade (</w:t>
+            </w:r>
+            <w:r>
+              <w:rPr>
+                <w:rStyle w:val="VerbatimChar"/>
+              </w:rPr>
+              <w:t xml:space="preserve">useBuyerDirectoryTeaserTotal</w:t>
+            </w:r>
+            <w:r>
+              <w:t xml:space="preserve">)</w:t>
+            </w:r>
+          </w:p>
+        </w:tc>
+        <w:tc>
+          <w:tcPr/>
+          <w:p>
+            <w:pPr>
+              <w:pStyle w:val="Compact"/>
+            </w:pPr>
+            <w:r>
+              <w:t xml:space="preserve">Conversion hook</w:t>
+            </w:r>
+          </w:p>
+        </w:tc>
+      </w:tr>
     </w:tbl>
+    <w:p>
+      <w:pPr>
+        <w:pStyle w:val="BodyText"/>
+      </w:pPr>
+      <w:r>
+        <w:rPr>
+          <w:i/>
+          <w:iCs/>
+        </w:rPr>
+        <w:t xml:space="preserve">Gating note:</w:t>
+      </w:r>
+      <w:r>
+        <w:t xml:space="preserve"> </w:t>
+      </w:r>
+      <w:r>
+        <w:t xml:space="preserve">directories require</w:t>
+      </w:r>
+      <w:r>
+        <w:t xml:space="preserve"> </w:t>
+      </w:r>
+      <w:r>
+        <w:rPr>
+          <w:b/>
+          <w:bCs/>
+        </w:rPr>
+        <w:t xml:space="preserve">paid Pro</w:t>
+      </w:r>
+      <w:r>
+        <w:t xml:space="preserve"> </w:t>
+      </w:r>
+      <w:r>
+        <w:t xml:space="preserve">(</w:t>
+      </w:r>
+      <w:r>
+        <w:rPr>
+          <w:rStyle w:val="VerbatimChar"/>
+        </w:rPr>
+        <w:t xml:space="preserve">isPaidPro</w:t>
+      </w:r>
+      <w:r>
+        <w:t xml:space="preserve">) — excluded from the 7-day trial. Trial users retain other Pro trial features but not directory contacts.</w:t>
+      </w:r>
+    </w:p>
     <w:p>
       <w:r>
         <w:pict>
@@ -5292,8 +5612,8 @@
         </w:pict>
       </w:r>
     </w:p>
-    <w:bookmarkEnd w:id="22"/>
-    <w:bookmarkStart w:id="23" w:name="export-reporting-wholesale-tools"/>
+    <w:bookmarkEnd w:id="23"/>
+    <w:bookmarkStart w:id="24" w:name="export-reporting-wholesale-tools"/>
     <w:p>
       <w:pPr>
         <w:pStyle w:val="Heading3"/>
@@ -5570,8 +5890,8 @@
         </w:pict>
       </w:r>
     </w:p>
-    <w:bookmarkEnd w:id="23"/>
-    <w:bookmarkStart w:id="24" w:name="account-authentication-monetization"/>
+    <w:bookmarkEnd w:id="24"/>
+    <w:bookmarkStart w:id="25" w:name="account-authentication-monetization"/>
     <w:p>
       <w:pPr>
         <w:pStyle w:val="Heading3"/>
@@ -5964,7 +6284,16 @@
               <w:pStyle w:val="Compact"/>
             </w:pPr>
             <w:r>
-              <w:t xml:space="preserve">Native in-app purchases via Capacitor</w:t>
+              <w:t xml:space="preserve">Native in-app purchases via Capacitor; entitlement</w:t>
+            </w:r>
+            <w:r>
+              <w:t xml:space="preserve"> </w:t>
+            </w:r>
+            <w:r>
+              <w:rPr>
+                <w:rStyle w:val="VerbatimChar"/>
+              </w:rPr>
+              <w:t xml:space="preserve">DealGapIQ Pro</w:t>
             </w:r>
           </w:p>
         </w:tc>
@@ -6093,8 +6422,8 @@
         </w:pict>
       </w:r>
     </w:p>
-    <w:bookmarkEnd w:id="24"/>
-    <w:bookmarkStart w:id="25" w:name="admin-platform-configuration"/>
+    <w:bookmarkEnd w:id="25"/>
+    <w:bookmarkStart w:id="26" w:name="admin-platform-configuration"/>
     <w:p>
       <w:pPr>
         <w:pStyle w:val="Heading3"/>
@@ -6328,8 +6657,8 @@
         </w:pict>
       </w:r>
     </w:p>
-    <w:bookmarkEnd w:id="25"/>
-    <w:bookmarkStart w:id="26" w:name="educational-seo-trust-content"/>
+    <w:bookmarkEnd w:id="26"/>
+    <w:bookmarkStart w:id="27" w:name="educational-seo-trust-content"/>
     <w:p>
       <w:pPr>
         <w:pStyle w:val="Heading3"/>
@@ -6735,8 +7064,8 @@
         </w:pict>
       </w:r>
     </w:p>
-    <w:bookmarkEnd w:id="26"/>
-    <w:bookmarkStart w:id="27" w:name="mobile-cross-platform-delivery"/>
+    <w:bookmarkEnd w:id="27"/>
+    <w:bookmarkStart w:id="28" w:name="mobile-cross-platform-delivery"/>
     <w:p>
       <w:pPr>
         <w:pStyle w:val="Heading3"/>
@@ -6978,8 +7307,8 @@
         </w:pict>
       </w:r>
     </w:p>
-    <w:bookmarkEnd w:id="27"/>
-    <w:bookmarkStart w:id="28" w:name="analysis-workflow-navigation"/>
+    <w:bookmarkEnd w:id="28"/>
+    <w:bookmarkStart w:id="29" w:name="analysis-workflow-navigation"/>
     <w:p>
       <w:pPr>
         <w:pStyle w:val="Heading3"/>
@@ -7001,7 +7330,7 @@
         <w:pStyle w:val="Compact"/>
         <w:numPr>
           <w:ilvl w:val="0"/>
-          <w:numId w:val="1001"/>
+          <w:numId w:val="1002"/>
         </w:numPr>
       </w:pPr>
       <w:r>
@@ -7026,7 +7355,7 @@
         <w:pStyle w:val="Compact"/>
         <w:numPr>
           <w:ilvl w:val="0"/>
-          <w:numId w:val="1001"/>
+          <w:numId w:val="1002"/>
         </w:numPr>
       </w:pPr>
       <w:r>
@@ -7051,7 +7380,7 @@
         <w:pStyle w:val="Compact"/>
         <w:numPr>
           <w:ilvl w:val="0"/>
-          <w:numId w:val="1001"/>
+          <w:numId w:val="1002"/>
         </w:numPr>
       </w:pPr>
       <w:r>
@@ -7076,7 +7405,7 @@
         <w:pStyle w:val="Compact"/>
         <w:numPr>
           <w:ilvl w:val="0"/>
-          <w:numId w:val="1001"/>
+          <w:numId w:val="1002"/>
         </w:numPr>
       </w:pPr>
       <w:r>
@@ -7101,7 +7430,7 @@
         <w:pStyle w:val="Compact"/>
         <w:numPr>
           <w:ilvl w:val="0"/>
-          <w:numId w:val="1001"/>
+          <w:numId w:val="1002"/>
         </w:numPr>
       </w:pPr>
       <w:r>
@@ -7133,9 +7462,9 @@
         </w:pict>
       </w:r>
     </w:p>
-    <w:bookmarkEnd w:id="28"/>
     <w:bookmarkEnd w:id="29"/>
-    <w:bookmarkStart w:id="30" w:name="subscription-tier-matrix-observable"/>
+    <w:bookmarkEnd w:id="30"/>
+    <w:bookmarkStart w:id="31" w:name="subscription-tier-matrix-observable"/>
     <w:p>
       <w:pPr>
         <w:pStyle w:val="Heading2"/>
@@ -7314,6 +7643,80 @@
               <w:pStyle w:val="Compact"/>
             </w:pPr>
             <w:r>
+              <w:t xml:space="preserve">Income Value · Target Buy · Deal Gap</w:t>
+            </w:r>
+          </w:p>
+        </w:tc>
+        <w:tc>
+          <w:tcPr/>
+          <w:p>
+            <w:pPr>
+              <w:pStyle w:val="Compact"/>
+              <w:jc w:val="center"/>
+            </w:pPr>
+            <w:r>
+              <w:t xml:space="preserve">Yes</w:t>
+            </w:r>
+          </w:p>
+        </w:tc>
+        <w:tc>
+          <w:tcPr/>
+          <w:p>
+            <w:pPr>
+              <w:pStyle w:val="Compact"/>
+              <w:jc w:val="center"/>
+            </w:pPr>
+            <w:r>
+              <w:t xml:space="preserve">Yes</w:t>
+            </w:r>
+          </w:p>
+        </w:tc>
+      </w:tr>
+      <w:tr>
+        <w:tc>
+          <w:tcPr/>
+          <w:p>
+            <w:pPr>
+              <w:pStyle w:val="Compact"/>
+            </w:pPr>
+            <w:r>
+              <w:t xml:space="preserve">Four Paths + pitch scripts on Discovery</w:t>
+            </w:r>
+          </w:p>
+        </w:tc>
+        <w:tc>
+          <w:tcPr/>
+          <w:p>
+            <w:pPr>
+              <w:pStyle w:val="Compact"/>
+              <w:jc w:val="center"/>
+            </w:pPr>
+            <w:r>
+              <w:t xml:space="preserve">Yes</w:t>
+            </w:r>
+          </w:p>
+        </w:tc>
+        <w:tc>
+          <w:tcPr/>
+          <w:p>
+            <w:pPr>
+              <w:pStyle w:val="Compact"/>
+              <w:jc w:val="center"/>
+            </w:pPr>
+            <w:r>
+              <w:t xml:space="preserve">Yes</w:t>
+            </w:r>
+          </w:p>
+        </w:tc>
+      </w:tr>
+      <w:tr>
+        <w:tc>
+          <w:tcPr/>
+          <w:p>
+            <w:pPr>
+              <w:pStyle w:val="Compact"/>
+            </w:pPr>
+            <w:r>
               <w:t xml:space="preserve">Multi-source IQ estimates + source selector</w:t>
             </w:r>
           </w:p>
@@ -7908,7 +8311,195 @@
           <w:i/>
           <w:iCs/>
         </w:rPr>
-        <w:t xml:space="preserve">Sources: PricingContent.tsx comparison table, TIER_LIMITS in backend/app/models/subscription.py</w:t>
+        <w:t xml:space="preserve">Sources:</w:t>
+      </w:r>
+      <w:r>
+        <w:rPr>
+          <w:i/>
+          <w:iCs/>
+        </w:rPr>
+        <w:t xml:space="preserve"> </w:t>
+      </w:r>
+      <w:r>
+        <w:rPr>
+          <w:rStyle w:val="VerbatimChar"/>
+          <w:i/>
+          <w:iCs/>
+        </w:rPr>
+        <w:t xml:space="preserve">PricingContent.tsx</w:t>
+      </w:r>
+      <w:r>
+        <w:rPr>
+          <w:i/>
+          <w:iCs/>
+        </w:rPr>
+        <w:t xml:space="preserve"> </w:t>
+      </w:r>
+      <w:r>
+        <w:rPr>
+          <w:i/>
+          <w:iCs/>
+        </w:rPr>
+        <w:t xml:space="preserve">comparison table;</w:t>
+      </w:r>
+      <w:r>
+        <w:rPr>
+          <w:i/>
+          <w:iCs/>
+        </w:rPr>
+        <w:t xml:space="preserve"> </w:t>
+      </w:r>
+      <w:r>
+        <w:rPr>
+          <w:rStyle w:val="VerbatimChar"/>
+          <w:i/>
+          <w:iCs/>
+        </w:rPr>
+        <w:t xml:space="preserve">TIER_LIMITS</w:t>
+      </w:r>
+      <w:r>
+        <w:rPr>
+          <w:i/>
+          <w:iCs/>
+        </w:rPr>
+        <w:t xml:space="preserve"> </w:t>
+      </w:r>
+      <w:r>
+        <w:rPr>
+          <w:i/>
+          <w:iCs/>
+        </w:rPr>
+        <w:t xml:space="preserve">in</w:t>
+      </w:r>
+      <w:r>
+        <w:rPr>
+          <w:i/>
+          <w:iCs/>
+        </w:rPr>
+        <w:t xml:space="preserve"> </w:t>
+      </w:r>
+      <w:r>
+        <w:rPr>
+          <w:rStyle w:val="VerbatimChar"/>
+          <w:i/>
+          <w:iCs/>
+        </w:rPr>
+        <w:t xml:space="preserve">backend/app/models/subscription.py</w:t>
+      </w:r>
+      <w:r>
+        <w:rPr>
+          <w:i/>
+          <w:iCs/>
+        </w:rPr>
+        <w:t xml:space="preserve">;</w:t>
+      </w:r>
+      <w:r>
+        <w:rPr>
+          <w:i/>
+          <w:iCs/>
+        </w:rPr>
+        <w:t xml:space="preserve"> </w:t>
+      </w:r>
+      <w:r>
+        <w:rPr>
+          <w:rStyle w:val="VerbatimChar"/>
+          <w:i/>
+          <w:iCs/>
+        </w:rPr>
+        <w:t xml:space="preserve">FREE_ANALYSES_PER_MONTH</w:t>
+      </w:r>
+      <w:r>
+        <w:rPr>
+          <w:i/>
+          <w:iCs/>
+        </w:rPr>
+        <w:t xml:space="preserve"> </w:t>
+      </w:r>
+      <w:r>
+        <w:rPr>
+          <w:i/>
+          <w:iCs/>
+        </w:rPr>
+        <w:t xml:space="preserve">in</w:t>
+      </w:r>
+      <w:r>
+        <w:rPr>
+          <w:i/>
+          <w:iCs/>
+        </w:rPr>
+        <w:t xml:space="preserve"> </w:t>
+      </w:r>
+      <w:r>
+        <w:rPr>
+          <w:rStyle w:val="VerbatimChar"/>
+          <w:i/>
+          <w:iCs/>
+        </w:rPr>
+        <w:t xml:space="preserve">frontend/src/constants/subscriptions.ts</w:t>
+      </w:r>
+      <w:r>
+        <w:rPr>
+          <w:i/>
+          <w:iCs/>
+        </w:rPr>
+        <w:t xml:space="preserve">.</w:t>
+      </w:r>
+    </w:p>
+    <w:p>
+      <w:pPr>
+        <w:pStyle w:val="BodyText"/>
+      </w:pPr>
+      <w:r>
+        <w:rPr>
+          <w:i/>
+          <w:iCs/>
+        </w:rPr>
+        <w:t xml:space="preserve">Enforcement note:</w:t>
+      </w:r>
+      <w:r>
+        <w:t xml:space="preserve"> </w:t>
+      </w:r>
+      <w:r>
+        <w:t xml:space="preserve">this matrix reflects published pricing policy. UI gating uses a mix of</w:t>
+      </w:r>
+      <w:r>
+        <w:t xml:space="preserve"> </w:t>
+      </w:r>
+      <w:r>
+        <w:rPr>
+          <w:rStyle w:val="VerbatimChar"/>
+        </w:rPr>
+        <w:t xml:space="preserve">ProGate</w:t>
+      </w:r>
+      <w:r>
+        <w:t xml:space="preserve">,</w:t>
+      </w:r>
+      <w:r>
+        <w:t xml:space="preserve"> </w:t>
+      </w:r>
+      <w:r>
+        <w:rPr>
+          <w:rStyle w:val="VerbatimChar"/>
+        </w:rPr>
+        <w:t xml:space="preserve">AuthGate</w:t>
+      </w:r>
+      <w:r>
+        <w:t xml:space="preserve"> </w:t>
+      </w:r>
+      <w:r>
+        <w:t xml:space="preserve">(sign-in only), and backend usage limits — not every Pro-marketed feature is wrapped in</w:t>
+      </w:r>
+      <w:r>
+        <w:t xml:space="preserve"> </w:t>
+      </w:r>
+      <w:r>
+        <w:rPr>
+          <w:rStyle w:val="VerbatimChar"/>
+        </w:rPr>
+        <w:t xml:space="preserve">ProGate</w:t>
+      </w:r>
+      <w:r>
+        <w:t xml:space="preserve">. Verify before legal or commercial commitments.</w:t>
       </w:r>
     </w:p>
     <w:p>
@@ -7918,8 +8509,8 @@
         </w:pict>
       </w:r>
     </w:p>
-    <w:bookmarkEnd w:id="30"/>
-    <w:bookmarkStart w:id="38" w:name="X545695a2692dbeb050b56865b0af61601224bd7"/>
+    <w:bookmarkEnd w:id="31"/>
+    <w:bookmarkStart w:id="39" w:name="X545695a2692dbeb050b56865b0af61601224bd7"/>
     <w:p>
       <w:pPr>
         <w:pStyle w:val="Heading2"/>
@@ -7928,7 +8519,7 @@
         <w:t xml:space="preserve">3. Unique Differentiators vs. Typical Competitor Offerings</w:t>
       </w:r>
     </w:p>
-    <w:bookmarkStart w:id="31" w:name="the-synthesis-layer-primary-moat"/>
+    <w:bookmarkStart w:id="32" w:name="the-synthesis-layer-primary-moat"/>
     <w:p>
       <w:pPr>
         <w:pStyle w:val="Heading3"/>
@@ -8034,8 +8625,8 @@
         </w:pict>
       </w:r>
     </w:p>
-    <w:bookmarkEnd w:id="31"/>
-    <w:bookmarkStart w:id="32" w:name="Xb0786b4c340980f459d2bdeb198efb035e09271"/>
+    <w:bookmarkEnd w:id="32"/>
+    <w:bookmarkStart w:id="33" w:name="Xb0786b4c340980f459d2bdeb198efb035e09271"/>
     <w:p>
       <w:pPr>
         <w:pStyle w:val="Heading3"/>
@@ -8434,8 +9025,8 @@
         </w:pict>
       </w:r>
     </w:p>
-    <w:bookmarkEnd w:id="32"/>
-    <w:bookmarkStart w:id="33" w:name="trust-first-data-architecture"/>
+    <w:bookmarkEnd w:id="33"/>
+    <w:bookmarkStart w:id="34" w:name="trust-first-data-architecture"/>
     <w:p>
       <w:pPr>
         <w:pStyle w:val="Heading3"/>
@@ -8695,8 +9286,8 @@
         </w:pict>
       </w:r>
     </w:p>
-    <w:bookmarkEnd w:id="33"/>
-    <w:bookmarkStart w:id="34" w:name="structure-aware-negotiation-enablement"/>
+    <w:bookmarkEnd w:id="34"/>
+    <w:bookmarkStart w:id="35" w:name="structure-aware-negotiation-enablement"/>
     <w:p>
       <w:pPr>
         <w:pStyle w:val="Heading3"/>
@@ -8887,8 +9478,8 @@
         </w:pict>
       </w:r>
     </w:p>
-    <w:bookmarkEnd w:id="34"/>
-    <w:bookmarkStart w:id="35" w:name="six-strategy-unified-platform"/>
+    <w:bookmarkEnd w:id="35"/>
+    <w:bookmarkStart w:id="36" w:name="six-strategy-unified-platform"/>
     <w:p>
       <w:pPr>
         <w:pStyle w:val="Heading3"/>
@@ -9015,8 +9606,8 @@
         </w:pict>
       </w:r>
     </w:p>
-    <w:bookmarkEnd w:id="35"/>
-    <w:bookmarkStart w:id="36" w:name="operational-loop-analysis-execution"/>
+    <w:bookmarkEnd w:id="36"/>
+    <w:bookmarkStart w:id="37" w:name="operational-loop-analysis-execution"/>
     <w:p>
       <w:pPr>
         <w:pStyle w:val="Heading3"/>
@@ -9038,7 +9629,7 @@
         <w:pStyle w:val="Compact"/>
         <w:numPr>
           <w:ilvl w:val="0"/>
-          <w:numId w:val="1002"/>
+          <w:numId w:val="1003"/>
         </w:numPr>
       </w:pPr>
       <w:r>
@@ -9053,7 +9644,7 @@
         <w:pStyle w:val="Compact"/>
         <w:numPr>
           <w:ilvl w:val="0"/>
-          <w:numId w:val="1002"/>
+          <w:numId w:val="1003"/>
         </w:numPr>
       </w:pPr>
       <w:r>
@@ -9068,7 +9659,7 @@
         <w:pStyle w:val="Compact"/>
         <w:numPr>
           <w:ilvl w:val="0"/>
-          <w:numId w:val="1002"/>
+          <w:numId w:val="1003"/>
         </w:numPr>
       </w:pPr>
       <w:r>
@@ -9083,7 +9674,7 @@
         <w:pStyle w:val="Compact"/>
         <w:numPr>
           <w:ilvl w:val="0"/>
-          <w:numId w:val="1002"/>
+          <w:numId w:val="1003"/>
         </w:numPr>
       </w:pPr>
       <w:r>
@@ -9098,11 +9689,11 @@
         <w:pStyle w:val="Compact"/>
         <w:numPr>
           <w:ilvl w:val="0"/>
-          <w:numId w:val="1002"/>
+          <w:numId w:val="1003"/>
         </w:numPr>
       </w:pPr>
       <w:r>
-        <w:t xml:space="preserve">Investor/lender directories for exit/finance partners</w:t>
+        <w:t xml:space="preserve">Investor directory (~2,800+ cash buyers) and lender directory (484 hard money lenders) for exit/finance partners</w:t>
       </w:r>
     </w:p>
     <w:p>
@@ -9133,8 +9724,8 @@
         </w:pict>
       </w:r>
     </w:p>
-    <w:bookmarkEnd w:id="36"/>
-    <w:bookmarkStart w:id="37" w:name="distribution-model-differentiation"/>
+    <w:bookmarkEnd w:id="37"/>
+    <w:bookmarkStart w:id="38" w:name="distribution-model-differentiation"/>
     <w:p>
       <w:pPr>
         <w:pStyle w:val="Heading3"/>
@@ -9285,9 +9876,9 @@
         </w:pict>
       </w:r>
     </w:p>
-    <w:bookmarkEnd w:id="37"/>
     <w:bookmarkEnd w:id="38"/>
-    <w:bookmarkStart w:id="39" w:name="X70542e6952ab2c6c1db3d6830e1427e35179dba"/>
+    <w:bookmarkEnd w:id="39"/>
+    <w:bookmarkStart w:id="40" w:name="X70542e6952ab2c6c1db3d6830e1427e35179dba"/>
     <w:p>
       <w:pPr>
         <w:pStyle w:val="Heading2"/>
@@ -10210,8 +10801,8 @@
         </w:pict>
       </w:r>
     </w:p>
-    <w:bookmarkEnd w:id="39"/>
-    <w:bookmarkStart w:id="40" w:name="X91bf7d530b630c03ccf75e763750c6ddb3c2121"/>
+    <w:bookmarkEnd w:id="40"/>
+    <w:bookmarkStart w:id="41" w:name="X91bf7d530b630c03ccf75e763750c6ddb3c2121"/>
     <w:p>
       <w:pPr>
         <w:pStyle w:val="Heading2"/>
@@ -10242,139 +10833,6 @@
       </w:r>
       <w:r>
         <w:t xml:space="preserve">from product docs:</w:t>
-      </w:r>
-    </w:p>
-    <w:p>
-      <w:pPr>
-        <w:pStyle w:val="Compact"/>
-        <w:numPr>
-          <w:ilvl w:val="0"/>
-          <w:numId w:val="1003"/>
-        </w:numPr>
-      </w:pPr>
-      <w:r>
-        <w:rPr>
-          <w:b/>
-          <w:bCs/>
-        </w:rPr>
-        <w:t xml:space="preserve">Not financial, legal, or investment advice</w:t>
-      </w:r>
-      <w:r>
-        <w:t xml:space="preserve"> </w:t>
-      </w:r>
-      <w:r>
-        <w:t xml:space="preserve">— analysis only</w:t>
-      </w:r>
-      <w:r>
-        <w:br/>
-      </w:r>
-    </w:p>
-    <w:p>
-      <w:pPr>
-        <w:pStyle w:val="Compact"/>
-        <w:numPr>
-          <w:ilvl w:val="0"/>
-          <w:numId w:val="1003"/>
-        </w:numPr>
-      </w:pPr>
-      <w:r>
-        <w:rPr>
-          <w:b/>
-          <w:bCs/>
-        </w:rPr>
-        <w:t xml:space="preserve">Wraparound mortgages and land contracts</w:t>
-      </w:r>
-      <w:r>
-        <w:t xml:space="preserve"> </w:t>
-      </w:r>
-      <w:r>
-        <w:t xml:space="preserve">— not modeled (deferred pending legal review)</w:t>
-      </w:r>
-      <w:r>
-        <w:br/>
-      </w:r>
-    </w:p>
-    <w:p>
-      <w:pPr>
-        <w:pStyle w:val="Compact"/>
-        <w:numPr>
-          <w:ilvl w:val="0"/>
-          <w:numId w:val="1003"/>
-        </w:numPr>
-      </w:pPr>
-      <w:r>
-        <w:rPr>
-          <w:b/>
-          <w:bCs/>
-        </w:rPr>
-        <w:t xml:space="preserve">Does not claim every property is a deal</w:t>
-      </w:r>
-      <w:r>
-        <w:t xml:space="preserve"> </w:t>
-      </w:r>
-      <w:r>
-        <w:t xml:space="preserve">— emphasizes structure over price tag</w:t>
-      </w:r>
-      <w:r>
-        <w:br/>
-      </w:r>
-    </w:p>
-    <w:p>
-      <w:pPr>
-        <w:pStyle w:val="Compact"/>
-        <w:numPr>
-          <w:ilvl w:val="0"/>
-          <w:numId w:val="1003"/>
-        </w:numPr>
-      </w:pPr>
-      <w:r>
-        <w:rPr>
-          <w:b/>
-          <w:bCs/>
-        </w:rPr>
-        <w:t xml:space="preserve">No syndication/REIT/passive investing tooling</w:t>
-      </w:r>
-      <w:r>
-        <w:br/>
-      </w:r>
-    </w:p>
-    <w:p>
-      <w:pPr>
-        <w:pStyle w:val="Compact"/>
-        <w:numPr>
-          <w:ilvl w:val="0"/>
-          <w:numId w:val="1003"/>
-        </w:numPr>
-      </w:pPr>
-      <w:r>
-        <w:rPr>
-          <w:b/>
-          <w:bCs/>
-        </w:rPr>
-        <w:t xml:space="preserve">Admin assumptions and regional defaults</w:t>
-      </w:r>
-      <w:r>
-        <w:t xml:space="preserve"> </w:t>
-      </w:r>
-      <w:r>
-        <w:t xml:space="preserve">— global formulas, not per-user bespoke models for free tier</w:t>
-      </w:r>
-    </w:p>
-    <w:p>
-      <w:r>
-        <w:pict>
-          <v:rect style="width:0;height:1.5pt" o:hralign="center" o:hrstd="t" o:hr="t"/>
-        </w:pict>
-      </w:r>
-    </w:p>
-    <w:bookmarkEnd w:id="40"/>
-    <w:bookmarkStart w:id="41" w:name="X4ba75b5690b9229e581c918958b085cc0d70be8"/>
-    <w:p>
-      <w:pPr>
-        <w:pStyle w:val="Heading2"/>
-      </w:pPr>
-      <w:r>
-        <w:t xml:space="preserve">6. Strategic Observations for Product Leadership</w:t>
       </w:r>
     </w:p>
     <w:p>
@@ -10390,13 +10848,13 @@
           <w:b/>
           <w:bCs/>
         </w:rPr>
-        <w:t xml:space="preserve">Highest defensible value</w:t>
+        <w:t xml:space="preserve">Not financial, legal, or investment advice</w:t>
       </w:r>
       <w:r>
         <w:t xml:space="preserve"> </w:t>
       </w:r>
       <w:r>
-        <w:t xml:space="preserve">sits in the Discovery → Four Paths → Pitch Script chain. Marketing, onboarding, and Pro gates should consistently reinforce this sequence.</w:t>
+        <w:t xml:space="preserve">— analysis only</w:t>
       </w:r>
       <w:r>
         <w:br/>
@@ -10415,13 +10873,13 @@
           <w:b/>
           <w:bCs/>
         </w:rPr>
-        <w:t xml:space="preserve">Free tier is deliberately generous on verdict + strategy snapshots</w:t>
+        <w:t xml:space="preserve">Wraparound mortgages and land contracts</w:t>
       </w:r>
       <w:r>
         <w:t xml:space="preserve"> </w:t>
       </w:r>
       <w:r>
-        <w:t xml:space="preserve">to drive acquisition; Pro monetizes depth (Deal Maker, comps, exports, map hunt, directories).</w:t>
+        <w:t xml:space="preserve">— not modeled (deferred pending legal review)</w:t>
       </w:r>
       <w:r>
         <w:br/>
@@ -10440,13 +10898,13 @@
           <w:b/>
           <w:bCs/>
         </w:rPr>
-        <w:t xml:space="preserve">Pipeline + rehab tracking</w:t>
+        <w:t xml:space="preserve">Does not claim every property is a deal</w:t>
       </w:r>
       <w:r>
         <w:t xml:space="preserve"> </w:t>
       </w:r>
       <w:r>
-        <w:t xml:space="preserve">differentiates against pure calculators but is secondary to the synthesis layer in positioning.</w:t>
+        <w:t xml:space="preserve">— emphasizes structure over price tag</w:t>
       </w:r>
       <w:r>
         <w:br/>
@@ -10465,13 +10923,7 @@
           <w:b/>
           <w:bCs/>
         </w:rPr>
-        <w:t xml:space="preserve">Trust architecture</w:t>
-      </w:r>
-      <w:r>
-        <w:t xml:space="preserve"> </w:t>
-      </w:r>
-      <w:r>
-        <w:t xml:space="preserve">(source selector, Unavailable states, methodology page) is a feature, not polish — it supports conversion with skeptical investors.</w:t>
+        <w:t xml:space="preserve">No syndication/REIT/passive investing tooling</w:t>
       </w:r>
       <w:r>
         <w:br/>
@@ -10490,6 +10942,145 @@
           <w:b/>
           <w:bCs/>
         </w:rPr>
+        <w:t xml:space="preserve">Admin assumptions and regional defaults</w:t>
+      </w:r>
+      <w:r>
+        <w:t xml:space="preserve"> </w:t>
+      </w:r>
+      <w:r>
+        <w:t xml:space="preserve">— global formulas, not per-user bespoke models for free tier</w:t>
+      </w:r>
+    </w:p>
+    <w:p>
+      <w:r>
+        <w:pict>
+          <v:rect style="width:0;height:1.5pt" o:hralign="center" o:hrstd="t" o:hr="t"/>
+        </w:pict>
+      </w:r>
+    </w:p>
+    <w:bookmarkEnd w:id="41"/>
+    <w:bookmarkStart w:id="42" w:name="X4ba75b5690b9229e581c918958b085cc0d70be8"/>
+    <w:p>
+      <w:pPr>
+        <w:pStyle w:val="Heading2"/>
+      </w:pPr>
+      <w:r>
+        <w:t xml:space="preserve">6. Strategic Observations for Product Leadership</w:t>
+      </w:r>
+    </w:p>
+    <w:p>
+      <w:pPr>
+        <w:pStyle w:val="Compact"/>
+        <w:numPr>
+          <w:ilvl w:val="0"/>
+          <w:numId w:val="1005"/>
+        </w:numPr>
+      </w:pPr>
+      <w:r>
+        <w:rPr>
+          <w:b/>
+          <w:bCs/>
+        </w:rPr>
+        <w:t xml:space="preserve">Highest defensible value</w:t>
+      </w:r>
+      <w:r>
+        <w:t xml:space="preserve"> </w:t>
+      </w:r>
+      <w:r>
+        <w:t xml:space="preserve">sits in the Discovery → Four Paths → Pitch Script chain. Marketing, onboarding, and Pro gates should consistently reinforce this sequence.</w:t>
+      </w:r>
+      <w:r>
+        <w:br/>
+      </w:r>
+    </w:p>
+    <w:p>
+      <w:pPr>
+        <w:pStyle w:val="Compact"/>
+        <w:numPr>
+          <w:ilvl w:val="0"/>
+          <w:numId w:val="1005"/>
+        </w:numPr>
+      </w:pPr>
+      <w:r>
+        <w:rPr>
+          <w:b/>
+          <w:bCs/>
+        </w:rPr>
+        <w:t xml:space="preserve">Free tier is deliberately generous on verdict + strategy snapshots</w:t>
+      </w:r>
+      <w:r>
+        <w:t xml:space="preserve"> </w:t>
+      </w:r>
+      <w:r>
+        <w:t xml:space="preserve">to drive acquisition; Pro monetizes depth (Deal Maker, comps, exports, map hunt, directories).</w:t>
+      </w:r>
+      <w:r>
+        <w:br/>
+      </w:r>
+    </w:p>
+    <w:p>
+      <w:pPr>
+        <w:pStyle w:val="Compact"/>
+        <w:numPr>
+          <w:ilvl w:val="0"/>
+          <w:numId w:val="1005"/>
+        </w:numPr>
+      </w:pPr>
+      <w:r>
+        <w:rPr>
+          <w:b/>
+          <w:bCs/>
+        </w:rPr>
+        <w:t xml:space="preserve">Pipeline + rehab tracking</w:t>
+      </w:r>
+      <w:r>
+        <w:t xml:space="preserve"> </w:t>
+      </w:r>
+      <w:r>
+        <w:t xml:space="preserve">differentiates against pure calculators but is secondary to the synthesis layer in positioning.</w:t>
+      </w:r>
+      <w:r>
+        <w:br/>
+      </w:r>
+    </w:p>
+    <w:p>
+      <w:pPr>
+        <w:pStyle w:val="Compact"/>
+        <w:numPr>
+          <w:ilvl w:val="0"/>
+          <w:numId w:val="1005"/>
+        </w:numPr>
+      </w:pPr>
+      <w:r>
+        <w:rPr>
+          <w:b/>
+          <w:bCs/>
+        </w:rPr>
+        <w:t xml:space="preserve">Trust architecture</w:t>
+      </w:r>
+      <w:r>
+        <w:t xml:space="preserve"> </w:t>
+      </w:r>
+      <w:r>
+        <w:t xml:space="preserve">(source selector, Unavailable states, methodology page) is a feature, not polish — it supports conversion with skeptical investors.</w:t>
+      </w:r>
+      <w:r>
+        <w:br/>
+      </w:r>
+    </w:p>
+    <w:p>
+      <w:pPr>
+        <w:pStyle w:val="Compact"/>
+        <w:numPr>
+          <w:ilvl w:val="0"/>
+          <w:numId w:val="1005"/>
+        </w:numPr>
+      </w:pPr>
+      <w:r>
+        <w:rPr>
+          <w:b/>
+          <w:bCs/>
+        </w:rPr>
         <w:t xml:space="preserve">Mobile camera + Capacitor</w:t>
       </w:r>
       <w:r>
@@ -10497,6 +11088,80 @@
       </w:r>
       <w:r>
         <w:t xml:space="preserve">align with field-acquisition personas (wholesalers, driving-for-dollars) but the core moat is structure + scripts, not scan novelty alone.</w:t>
+      </w:r>
+    </w:p>
+    <w:p>
+      <w:pPr>
+        <w:pStyle w:val="Compact"/>
+        <w:numPr>
+          <w:ilvl w:val="0"/>
+          <w:numId w:val="1005"/>
+        </w:numPr>
+      </w:pPr>
+      <w:r>
+        <w:rPr>
+          <w:b/>
+          <w:bCs/>
+        </w:rPr>
+        <w:t xml:space="preserve">Fix stale external facts before reuse.</w:t>
+      </w:r>
+      <w:r>
+        <w:t xml:space="preserve"> </w:t>
+      </w:r>
+      <w:r>
+        <w:t xml:space="preserve">Correct any</w:t>
+      </w:r>
+      <w:r>
+        <w:t xml:space="preserve"> </w:t>
+      </w:r>
+      <w:r>
+        <w:t xml:space="preserve">“5 free analyses,”</w:t>
+      </w:r>
+      <w:r>
+        <w:t xml:space="preserve"> </w:t>
+      </w:r>
+      <w:r>
+        <w:t xml:space="preserve">“$29/$39,”</w:t>
+      </w:r>
+      <w:r>
+        <w:t xml:space="preserve"> </w:t>
+      </w:r>
+      <w:r>
+        <w:t xml:space="preserve">or</w:t>
+      </w:r>
+      <w:r>
+        <w:t xml:space="preserve"> </w:t>
+      </w:r>
+      <w:r>
+        <w:t xml:space="preserve">“Expo”</w:t>
+      </w:r>
+      <w:r>
+        <w:t xml:space="preserve"> </w:t>
+      </w:r>
+      <w:r>
+        <w:t xml:space="preserve">references in decks, scripts, and store listings to 3/month, $39.99 monthly / $349.99 annual (~$29.17/mo), and Capacitor.</w:t>
+      </w:r>
+    </w:p>
+    <w:p>
+      <w:pPr>
+        <w:pStyle w:val="Compact"/>
+        <w:numPr>
+          <w:ilvl w:val="0"/>
+          <w:numId w:val="1005"/>
+        </w:numPr>
+      </w:pPr>
+      <w:r>
+        <w:rPr>
+          <w:b/>
+          <w:bCs/>
+        </w:rPr>
+        <w:t xml:space="preserve">Keep Income Gap internal.</w:t>
+      </w:r>
+      <w:r>
+        <w:t xml:space="preserve"> </w:t>
+      </w:r>
+      <w:r>
+        <w:t xml:space="preserve">Present only Income Value, Target Buy, and Deal Gap to users; do not conflate Deal Gap with Income Value or Income Gap in user-facing copy.</w:t>
       </w:r>
     </w:p>
     <w:p>
@@ -10518,8 +11183,8 @@
         <w:t xml:space="preserve">This audit reflects codebase and internal documentation as of the current repository state. Feature availability may vary by subscription status, environment configuration (Stripe/RevenueCat keys), and data partner availability.</w:t>
       </w:r>
     </w:p>
-    <w:bookmarkEnd w:id="41"/>
     <w:bookmarkEnd w:id="42"/>
+    <w:bookmarkEnd w:id="43"/>
     <w:sectPr>
       <w:footnotePr>
         <w:numRestart w:val="eachSect"/>
@@ -10624,91 +11289,6 @@
     <w:lvl w:ilvl="8">
       <w:numFmt w:val="bullet"/>
       <w:lvlText w:val=" "/>
-      <w:lvlJc w:val="left"/>
-      <w:pPr>
-        <w:ind w:left="6480" w:hanging="360"/>
-      </w:pPr>
-    </w:lvl>
-  </w:abstractNum>
-  <w:abstractNum w:abstractNumId="99411">
-    <w:nsid w:val="00A99411"/>
-    <w:multiLevelType w:val="multilevel"/>
-    <w:lvl w:ilvl="0">
-      <w:start w:val="1"/>
-      <w:numFmt w:val="decimal"/>
-      <w:lvlText w:val="%1."/>
-      <w:lvlJc w:val="left"/>
-      <w:pPr>
-        <w:ind w:left="720" w:hanging="360"/>
-      </w:pPr>
-    </w:lvl>
-    <w:lvl w:ilvl="1">
-      <w:start w:val="1"/>
-      <w:numFmt w:val="decimal"/>
-      <w:lvlText w:val="%2."/>
-      <w:lvlJc w:val="left"/>
-      <w:pPr>
-        <w:ind w:left="1440" w:hanging="360"/>
-      </w:pPr>
-    </w:lvl>
-    <w:lvl w:ilvl="2">
-      <w:start w:val="1"/>
-      <w:numFmt w:val="decimal"/>
-      <w:lvlText w:val="%3."/>
-      <w:lvlJc w:val="left"/>
-      <w:pPr>
-        <w:ind w:left="2160" w:hanging="360"/>
-      </w:pPr>
-    </w:lvl>
-    <w:lvl w:ilvl="3">
-      <w:start w:val="1"/>
-      <w:numFmt w:val="decimal"/>
-      <w:lvlText w:val="%4."/>
-      <w:lvlJc w:val="left"/>
-      <w:pPr>
-        <w:ind w:left="2880" w:hanging="360"/>
-      </w:pPr>
-    </w:lvl>
-    <w:lvl w:ilvl="4">
-      <w:start w:val="1"/>
-      <w:numFmt w:val="decimal"/>
-      <w:lvlText w:val="%5."/>
-      <w:lvlJc w:val="left"/>
-      <w:pPr>
-        <w:ind w:left="3600" w:hanging="360"/>
-      </w:pPr>
-    </w:lvl>
-    <w:lvl w:ilvl="5">
-      <w:start w:val="1"/>
-      <w:numFmt w:val="decimal"/>
-      <w:lvlText w:val="%6."/>
-      <w:lvlJc w:val="left"/>
-      <w:pPr>
-        <w:ind w:left="4320" w:hanging="360"/>
-      </w:pPr>
-    </w:lvl>
-    <w:lvl w:ilvl="6">
-      <w:start w:val="1"/>
-      <w:numFmt w:val="decimal"/>
-      <w:lvlText w:val="%7."/>
-      <w:lvlJc w:val="left"/>
-      <w:pPr>
-        <w:ind w:left="5040" w:hanging="360"/>
-      </w:pPr>
-    </w:lvl>
-    <w:lvl w:ilvl="7">
-      <w:start w:val="1"/>
-      <w:numFmt w:val="decimal"/>
-      <w:lvlText w:val="%8."/>
-      <w:lvlJc w:val="left"/>
-      <w:pPr>
-        <w:ind w:left="5760" w:hanging="360"/>
-      </w:pPr>
-    </w:lvl>
-    <w:lvl w:ilvl="8">
-      <w:start w:val="1"/>
-      <w:numFmt w:val="decimal"/>
-      <w:lvlText w:val="%9."/>
       <w:lvlJc w:val="left"/>
       <w:pPr>
         <w:ind w:left="6480" w:hanging="360"/>
@@ -10818,10 +11398,98 @@
       </w:rPr>
     </w:lvl>
   </w:abstractNum>
+  <w:abstractNum w:abstractNumId="99411">
+    <w:nsid w:val="00A99411"/>
+    <w:multiLevelType w:val="multilevel"/>
+    <w:lvl w:ilvl="0">
+      <w:start w:val="1"/>
+      <w:numFmt w:val="decimal"/>
+      <w:lvlText w:val="%1."/>
+      <w:lvlJc w:val="left"/>
+      <w:pPr>
+        <w:ind w:left="720" w:hanging="360"/>
+      </w:pPr>
+    </w:lvl>
+    <w:lvl w:ilvl="1">
+      <w:start w:val="1"/>
+      <w:numFmt w:val="decimal"/>
+      <w:lvlText w:val="%2."/>
+      <w:lvlJc w:val="left"/>
+      <w:pPr>
+        <w:ind w:left="1440" w:hanging="360"/>
+      </w:pPr>
+    </w:lvl>
+    <w:lvl w:ilvl="2">
+      <w:start w:val="1"/>
+      <w:numFmt w:val="decimal"/>
+      <w:lvlText w:val="%3."/>
+      <w:lvlJc w:val="left"/>
+      <w:pPr>
+        <w:ind w:left="2160" w:hanging="360"/>
+      </w:pPr>
+    </w:lvl>
+    <w:lvl w:ilvl="3">
+      <w:start w:val="1"/>
+      <w:numFmt w:val="decimal"/>
+      <w:lvlText w:val="%4."/>
+      <w:lvlJc w:val="left"/>
+      <w:pPr>
+        <w:ind w:left="2880" w:hanging="360"/>
+      </w:pPr>
+    </w:lvl>
+    <w:lvl w:ilvl="4">
+      <w:start w:val="1"/>
+      <w:numFmt w:val="decimal"/>
+      <w:lvlText w:val="%5."/>
+      <w:lvlJc w:val="left"/>
+      <w:pPr>
+        <w:ind w:left="3600" w:hanging="360"/>
+      </w:pPr>
+    </w:lvl>
+    <w:lvl w:ilvl="5">
+      <w:start w:val="1"/>
+      <w:numFmt w:val="decimal"/>
+      <w:lvlText w:val="%6."/>
+      <w:lvlJc w:val="left"/>
+      <w:pPr>
+        <w:ind w:left="4320" w:hanging="360"/>
+      </w:pPr>
+    </w:lvl>
+    <w:lvl w:ilvl="6">
+      <w:start w:val="1"/>
+      <w:numFmt w:val="decimal"/>
+      <w:lvlText w:val="%7."/>
+      <w:lvlJc w:val="left"/>
+      <w:pPr>
+        <w:ind w:left="5040" w:hanging="360"/>
+      </w:pPr>
+    </w:lvl>
+    <w:lvl w:ilvl="7">
+      <w:start w:val="1"/>
+      <w:numFmt w:val="decimal"/>
+      <w:lvlText w:val="%8."/>
+      <w:lvlJc w:val="left"/>
+      <w:pPr>
+        <w:ind w:left="5760" w:hanging="360"/>
+      </w:pPr>
+    </w:lvl>
+    <w:lvl w:ilvl="8">
+      <w:start w:val="1"/>
+      <w:numFmt w:val="decimal"/>
+      <w:lvlText w:val="%9."/>
+      <w:lvlJc w:val="left"/>
+      <w:pPr>
+        <w:ind w:left="6480" w:hanging="360"/>
+      </w:pPr>
+    </w:lvl>
+  </w:abstractNum>
   <w:num w:numId="1000">
     <w:abstractNumId w:val="990"/>
   </w:num>
   <w:num w:numId="1001">
+    <w:abstractNumId w:val="991"/>
+  </w:num>
+  <w:num w:numId="1002">
     <w:abstractNumId w:val="99411"/>
     <w:lvlOverride w:ilvl="0">
       <w:startOverride w:val="1"/>
@@ -10851,13 +11519,13 @@
       <w:startOverride w:val="1"/>
     </w:lvlOverride>
   </w:num>
-  <w:num w:numId="1002">
-    <w:abstractNumId w:val="991"/>
-  </w:num>
   <w:num w:numId="1003">
     <w:abstractNumId w:val="991"/>
   </w:num>
   <w:num w:numId="1004">
+    <w:abstractNumId w:val="991"/>
+  </w:num>
+  <w:num w:numId="1005">
     <w:abstractNumId w:val="99411"/>
     <w:lvlOverride w:ilvl="0">
       <w:startOverride w:val="1"/>

</xml_diff>